<commit_message>
copa mundo e grandes ajustes 3
</commit_message>
<xml_diff>
--- a/Ajuda/TUTORIAL - BANCO DE TESTE.docx
+++ b/Ajuda/TUTORIAL - BANCO DE TESTE.docx
@@ -129,7 +129,7 @@
     <w:p>
       <w:r>
         <w:pict w14:anchorId="711DBC2D">
-          <v:rect id="_x0000_i1073" style="width:0;height:1.5pt" o:hralign="center" o:hrstd="t" o:hr="t" fillcolor="#a0a0a0" stroked="f"/>
+          <v:rect id="_x0000_i1025" style="width:0;height:1.5pt" o:hralign="center" o:hrstd="t" o:hr="t" fillcolor="#a0a0a0" stroked="f"/>
         </w:pict>
       </w:r>
     </w:p>
@@ -183,7 +183,7 @@
     <w:p>
       <w:r>
         <w:pict w14:anchorId="1CC8F13A">
-          <v:rect id="_x0000_i1074" style="width:0;height:1.5pt" o:hralign="center" o:hrstd="t" o:hr="t" fillcolor="#a0a0a0" stroked="f"/>
+          <v:rect id="_x0000_i1026" style="width:0;height:1.5pt" o:hralign="center" o:hrstd="t" o:hr="t" fillcolor="#a0a0a0" stroked="f"/>
         </w:pict>
       </w:r>
     </w:p>
@@ -243,7 +243,7 @@
     <w:p>
       <w:r>
         <w:pict w14:anchorId="63DB00AE">
-          <v:rect id="_x0000_i1075" style="width:0;height:1.5pt" o:hralign="center" o:hrstd="t" o:hr="t" fillcolor="#a0a0a0" stroked="f"/>
+          <v:rect id="_x0000_i1027" style="width:0;height:1.5pt" o:hralign="center" o:hrstd="t" o:hr="t" fillcolor="#a0a0a0" stroked="f"/>
         </w:pict>
       </w:r>
     </w:p>
@@ -278,7 +278,7 @@
     <w:p>
       <w:r>
         <w:pict w14:anchorId="63B5FF68">
-          <v:rect id="_x0000_i1076" style="width:0;height:1.5pt" o:hralign="center" o:hrstd="t" o:hr="t" fillcolor="#a0a0a0" stroked="f"/>
+          <v:rect id="_x0000_i1028" style="width:0;height:1.5pt" o:hralign="center" o:hrstd="t" o:hr="t" fillcolor="#a0a0a0" stroked="f"/>
         </w:pict>
       </w:r>
     </w:p>
@@ -359,7 +359,13 @@
       </w:r>
       <w:proofErr w:type="spellEnd"/>
       <w:r>
-        <w:t xml:space="preserve"> -v "C:\backups_postgres\cartola_fc\teste_1.backup"</w:t>
+        <w:t xml:space="preserve"> -v "C:\backups_postgres\cartola_fc\teste_</w:t>
+      </w:r>
+      <w:r>
+        <w:t>3</w:t>
+      </w:r>
+      <w:r>
+        <w:t>.backup"</w:t>
       </w:r>
     </w:p>
     <w:p>
@@ -376,7 +382,7 @@
     <w:p>
       <w:r>
         <w:pict w14:anchorId="58141DB5">
-          <v:rect id="_x0000_i1077" style="width:0;height:1.5pt" o:hralign="center" o:hrstd="t" o:hr="t" fillcolor="#a0a0a0" stroked="f"/>
+          <v:rect id="_x0000_i1029" style="width:0;height:1.5pt" o:hralign="center" o:hrstd="t" o:hr="t" fillcolor="#a0a0a0" stroked="f"/>
         </w:pict>
       </w:r>
     </w:p>
@@ -475,7 +481,7 @@
     <w:p>
       <w:r>
         <w:pict w14:anchorId="16C49C4C">
-          <v:rect id="_x0000_i1078" style="width:0;height:1.5pt" o:hralign="center" o:hrstd="t" o:hr="t" fillcolor="#a0a0a0" stroked="f"/>
+          <v:rect id="_x0000_i1030" style="width:0;height:1.5pt" o:hralign="center" o:hrstd="t" o:hr="t" fillcolor="#a0a0a0" stroked="f"/>
         </w:pict>
       </w:r>
     </w:p>
@@ -530,7 +536,7 @@
     <w:p>
       <w:r>
         <w:pict w14:anchorId="0FACC689">
-          <v:rect id="_x0000_i1079" style="width:0;height:1.5pt" o:hralign="center" o:hrstd="t" o:hr="t" fillcolor="#a0a0a0" stroked="f"/>
+          <v:rect id="_x0000_i1031" style="width:0;height:1.5pt" o:hralign="center" o:hrstd="t" o:hr="t" fillcolor="#a0a0a0" stroked="f"/>
         </w:pict>
       </w:r>
     </w:p>
@@ -604,7 +610,7 @@
     <w:p>
       <w:r>
         <w:pict w14:anchorId="72492EB6">
-          <v:rect id="_x0000_i1080" style="width:0;height:1.5pt" o:hralign="center" o:hrstd="t" o:hr="t" fillcolor="#a0a0a0" stroked="f"/>
+          <v:rect id="_x0000_i1032" style="width:0;height:1.5pt" o:hralign="center" o:hrstd="t" o:hr="t" fillcolor="#a0a0a0" stroked="f"/>
         </w:pict>
       </w:r>
     </w:p>
@@ -1293,6 +1299,7 @@
   <w:style w:type="character" w:default="1" w:styleId="Fontepargpadro">
     <w:name w:val="Default Paragraph Font"/>
     <w:uiPriority w:val="1"/>
+    <w:semiHidden/>
     <w:unhideWhenUsed/>
   </w:style>
   <w:style w:type="table" w:default="1" w:styleId="Tabelanormal">

</xml_diff>